<commit_message>
feat: complete platform integration, 4 academic pillars, marine rescue and diagnostic probes
</commit_message>
<xml_diff>
--- a/AquaShield_Project_Report.docx
+++ b/AquaShield_Project_Report.docx
@@ -1853,6 +1853,391 @@
         </w:tc>
       </w:tr>
     </w:tbl>
+    <w:p>
+      <w:pPr>
+        <w:spacing w:after="280"/>
+      </w:pPr>
+    </w:p>
+    <w:p>
+      <w:pPr>
+        <w:keepNext/>
+        <w:spacing w:before="360" w:after="120"/>
+      </w:pPr>
+      <w:r>
+        <w:rPr>
+          <w:b/>
+          <w:color w:val="07111E"/>
+          <w:sz w:val="32"/>
+        </w:rPr>
+        <w:t>10. Academic &amp; Technical Subject Alignment &amp; System Integration</w:t>
+      </w:r>
+    </w:p>
+    <w:p>
+      <w:r>
+        <w:t>AquaShield AI explicitly embodies four foundational academic and engineering disciplines, unifying them into an end-to-end resilient architecture with zero functional gaps or disconnects:</w:t>
+      </w:r>
+    </w:p>
+    <w:tbl>
+      <w:tblPr>
+        <w:tblW w:type="auto" w:w="0"/>
+        <w:jc w:val="center"/>
+        <w:tblLook w:firstColumn="1" w:firstRow="1" w:lastColumn="0" w:lastRow="0" w:noHBand="0" w:noVBand="1" w:val="04A0"/>
+      </w:tblPr>
+      <w:tblGrid>
+        <w:gridCol w:w="3120"/>
+        <w:gridCol w:w="3120"/>
+        <w:gridCol w:w="3120"/>
+      </w:tblGrid>
+      <w:tr>
+        <w:tc>
+          <w:tcPr>
+            <w:tcW w:type="dxa" w:w="3120"/>
+            <w:shd w:fill="0F172A"/>
+            <w:tcMar>
+              <w:top w:w="80" w:type="dxa"/>
+              <w:bottom w:w="80" w:type="dxa"/>
+              <w:left w:w="100" w:type="dxa"/>
+              <w:right w:w="100" w:type="dxa"/>
+            </w:tcMar>
+          </w:tcPr>
+          <w:p>
+            <w:r>
+              <w:rPr>
+                <w:b/>
+                <w:color w:val="F8FAFC"/>
+                <w:sz w:val="20"/>
+              </w:rPr>
+              <w:t>Academic Subject Pillar</w:t>
+            </w:r>
+          </w:p>
+        </w:tc>
+        <w:tc>
+          <w:tcPr>
+            <w:tcW w:type="dxa" w:w="3120"/>
+            <w:shd w:fill="0F172A"/>
+            <w:tcMar>
+              <w:top w:w="80" w:type="dxa"/>
+              <w:bottom w:w="80" w:type="dxa"/>
+              <w:left w:w="100" w:type="dxa"/>
+              <w:right w:w="100" w:type="dxa"/>
+            </w:tcMar>
+          </w:tcPr>
+          <w:p>
+            <w:r>
+              <w:rPr>
+                <w:b/>
+                <w:color w:val="F8FAFC"/>
+                <w:sz w:val="20"/>
+              </w:rPr>
+              <w:t>Platform Integration &amp; Technical Scope</w:t>
+            </w:r>
+          </w:p>
+        </w:tc>
+        <w:tc>
+          <w:tcPr>
+            <w:tcW w:type="dxa" w:w="3120"/>
+            <w:shd w:fill="0F172A"/>
+            <w:tcMar>
+              <w:top w:w="80" w:type="dxa"/>
+              <w:bottom w:w="80" w:type="dxa"/>
+              <w:left w:w="100" w:type="dxa"/>
+              <w:right w:w="100" w:type="dxa"/>
+            </w:tcMar>
+          </w:tcPr>
+          <w:p>
+            <w:r>
+              <w:rPr>
+                <w:b/>
+                <w:color w:val="F8FAFC"/>
+                <w:sz w:val="20"/>
+              </w:rPr>
+              <w:t>Key Code Modules &amp; Endpoints</w:t>
+            </w:r>
+          </w:p>
+        </w:tc>
+      </w:tr>
+      <w:tr>
+        <w:tc>
+          <w:tcPr>
+            <w:tcW w:type="dxa" w:w="2592"/>
+            <w:tcMar>
+              <w:top w:w="60" w:type="dxa"/>
+              <w:bottom w:w="60" w:type="dxa"/>
+              <w:left w:w="80" w:type="dxa"/>
+              <w:right w:w="80" w:type="dxa"/>
+            </w:tcMar>
+            <w:shd w:fill="F8FAFC"/>
+          </w:tcPr>
+          <w:p>
+            <w:r>
+              <w:rPr>
+                <w:b/>
+                <w:sz w:val="19"/>
+              </w:rPr>
+              <w:t>1. System &amp; Subject Integration</w:t>
+            </w:r>
+          </w:p>
+        </w:tc>
+        <w:tc>
+          <w:tcPr>
+            <w:tcW w:type="dxa" w:w="3888"/>
+            <w:tcMar>
+              <w:top w:w="60" w:type="dxa"/>
+              <w:bottom w:w="60" w:type="dxa"/>
+              <w:left w:w="80" w:type="dxa"/>
+              <w:right w:w="80" w:type="dxa"/>
+            </w:tcMar>
+            <w:shd w:fill="F8FAFC"/>
+          </w:tcPr>
+          <w:p>
+            <w:r>
+              <w:rPr>
+                <w:sz w:val="19"/>
+              </w:rPr>
+              <w:t>Decoupled, fault-tolerant 3-tier architecture unifying PWA offline cache (sw.js), FastAPI ASGI router assembly (9 feature routers), Async SQLAlchemy 2.0 ORM, WebSocket emergency broadcast mesh, and native SMS URI fallback.</w:t>
+            </w:r>
+          </w:p>
+        </w:tc>
+        <w:tc>
+          <w:tcPr>
+            <w:tcW w:type="dxa" w:w="2880"/>
+            <w:tcMar>
+              <w:top w:w="60" w:type="dxa"/>
+              <w:bottom w:w="60" w:type="dxa"/>
+              <w:left w:w="80" w:type="dxa"/>
+              <w:right w:w="80" w:type="dxa"/>
+            </w:tcMar>
+            <w:shd w:fill="F8FAFC"/>
+          </w:tcPr>
+          <w:p>
+            <w:r>
+              <w:rPr>
+                <w:sz w:val="19"/>
+              </w:rPr>
+              <w:t>backend/app/main.py</w:t>
+              <w:br/>
+              <w:t>backend/app/routers/</w:t>
+              <w:br/>
+              <w:t>sw.js &amp; mesh_broadcast.js</w:t>
+              <w:br/>
+              <w:t>GET /api/health</w:t>
+            </w:r>
+          </w:p>
+        </w:tc>
+      </w:tr>
+      <w:tr>
+        <w:tc>
+          <w:tcPr>
+            <w:tcW w:type="dxa" w:w="2592"/>
+            <w:tcMar>
+              <w:top w:w="60" w:type="dxa"/>
+              <w:bottom w:w="60" w:type="dxa"/>
+              <w:left w:w="80" w:type="dxa"/>
+              <w:right w:w="80" w:type="dxa"/>
+            </w:tcMar>
+            <w:shd w:fill="FFFFFF"/>
+          </w:tcPr>
+          <w:p>
+            <w:r>
+              <w:rPr>
+                <w:b/>
+                <w:sz w:val="19"/>
+              </w:rPr>
+              <w:t>2. Data Analysis &amp; Visualization</w:t>
+            </w:r>
+          </w:p>
+        </w:tc>
+        <w:tc>
+          <w:tcPr>
+            <w:tcW w:type="dxa" w:w="3888"/>
+            <w:tcMar>
+              <w:top w:w="60" w:type="dxa"/>
+              <w:bottom w:w="60" w:type="dxa"/>
+              <w:left w:w="80" w:type="dxa"/>
+              <w:right w:w="80" w:type="dxa"/>
+            </w:tcMar>
+            <w:shd w:fill="FFFFFF"/>
+          </w:tcPr>
+          <w:p>
+            <w:r>
+              <w:rPr>
+                <w:sz w:val="19"/>
+              </w:rPr>
+              <w:t>Continuous oceanographic buoy ingestion, Coastal Hazard Index (CHI) calculation, topographic elevation-risk modeling (avoiding lowlands &lt;5m), Chart.js wave/wind time-series, and MapLibre/Leaflet 3D GIS vector radars.</w:t>
+            </w:r>
+          </w:p>
+        </w:tc>
+        <w:tc>
+          <w:tcPr>
+            <w:tcW w:type="dxa" w:w="2880"/>
+            <w:tcMar>
+              <w:top w:w="60" w:type="dxa"/>
+              <w:bottom w:w="60" w:type="dxa"/>
+              <w:left w:w="80" w:type="dxa"/>
+              <w:right w:w="80" w:type="dxa"/>
+            </w:tcMar>
+            <w:shd w:fill="FFFFFF"/>
+          </w:tcPr>
+          <w:p>
+            <w:r>
+              <w:rPr>
+                <w:sz w:val="19"/>
+              </w:rPr>
+              <w:t>backend/app/routers/disasters.py</w:t>
+              <w:br/>
+              <w:t>backend/app/services/route_service.py</w:t>
+              <w:br/>
+              <w:t>GET /api/disasters</w:t>
+              <w:br/>
+              <w:t>POST /api/routes/calculate</w:t>
+            </w:r>
+          </w:p>
+        </w:tc>
+      </w:tr>
+      <w:tr>
+        <w:tc>
+          <w:tcPr>
+            <w:tcW w:type="dxa" w:w="2592"/>
+            <w:tcMar>
+              <w:top w:w="60" w:type="dxa"/>
+              <w:bottom w:w="60" w:type="dxa"/>
+              <w:left w:w="80" w:type="dxa"/>
+              <w:right w:w="80" w:type="dxa"/>
+            </w:tcMar>
+            <w:shd w:fill="F8FAFC"/>
+          </w:tcPr>
+          <w:p>
+            <w:r>
+              <w:rPr>
+                <w:b/>
+                <w:sz w:val="19"/>
+              </w:rPr>
+              <w:t>3. Internet Security System</w:t>
+            </w:r>
+          </w:p>
+        </w:tc>
+        <w:tc>
+          <w:tcPr>
+            <w:tcW w:type="dxa" w:w="3888"/>
+            <w:tcMar>
+              <w:top w:w="60" w:type="dxa"/>
+              <w:bottom w:w="60" w:type="dxa"/>
+              <w:left w:w="80" w:type="dxa"/>
+              <w:right w:w="80" w:type="dxa"/>
+            </w:tcMar>
+            <w:shd w:fill="F8FAFC"/>
+          </w:tcPr>
+          <w:p>
+            <w:r>
+              <w:rPr>
+                <w:sz w:val="19"/>
+              </w:rPr>
+              <w:t>Defense-in-depth ASGI headers (nosniff, SAMEORIGIN, Geolocation permissions policy), strict Pydantic v2 input sanitization mitigating SQLi/XSS, PBKDF2 HMAC-SHA256 password hashing with salt, and stateless JWT token authorization.</w:t>
+            </w:r>
+          </w:p>
+        </w:tc>
+        <w:tc>
+          <w:tcPr>
+            <w:tcW w:type="dxa" w:w="2880"/>
+            <w:tcMar>
+              <w:top w:w="60" w:type="dxa"/>
+              <w:bottom w:w="60" w:type="dxa"/>
+              <w:left w:w="80" w:type="dxa"/>
+              <w:right w:w="80" w:type="dxa"/>
+            </w:tcMar>
+            <w:shd w:fill="F8FAFC"/>
+          </w:tcPr>
+          <w:p>
+            <w:r>
+              <w:rPr>
+                <w:sz w:val="19"/>
+              </w:rPr>
+              <w:t>backend/app/main.py (Middleware)</w:t>
+              <w:br/>
+              <w:t>backend/app/routers/auth.py</w:t>
+              <w:br/>
+              <w:t>backend/app/schemas/</w:t>
+              <w:br/>
+              <w:t>POST /api/auth/login</w:t>
+            </w:r>
+          </w:p>
+        </w:tc>
+      </w:tr>
+      <w:tr>
+        <w:tc>
+          <w:tcPr>
+            <w:tcW w:type="dxa" w:w="2592"/>
+            <w:tcMar>
+              <w:top w:w="60" w:type="dxa"/>
+              <w:bottom w:w="60" w:type="dxa"/>
+              <w:left w:w="80" w:type="dxa"/>
+              <w:right w:w="80" w:type="dxa"/>
+            </w:tcMar>
+            <w:shd w:fill="FFFFFF"/>
+          </w:tcPr>
+          <w:p>
+            <w:r>
+              <w:rPr>
+                <w:b/>
+                <w:sz w:val="19"/>
+              </w:rPr>
+              <w:t>4. Machine Learning Fundamentals</w:t>
+            </w:r>
+          </w:p>
+        </w:tc>
+        <w:tc>
+          <w:tcPr>
+            <w:tcW w:type="dxa" w:w="3888"/>
+            <w:tcMar>
+              <w:top w:w="60" w:type="dxa"/>
+              <w:bottom w:w="60" w:type="dxa"/>
+              <w:left w:w="80" w:type="dxa"/>
+              <w:right w:w="80" w:type="dxa"/>
+            </w:tcMar>
+            <w:shd w:fill="FFFFFF"/>
+          </w:tcPr>
+          <w:p>
+            <w:r>
+              <w:rPr>
+                <w:sz w:val="19"/>
+              </w:rPr>
+              <w:t>Dual-Stream Deep Learning (DualStreamForensicNet with EfficientNet-B0 RGB + ELA CASIA2 backbones), Error Level Analysis (ELA) compression gradients, Laplacian frequency noise entropy, and fluid sheen spectral verification.</w:t>
+            </w:r>
+          </w:p>
+        </w:tc>
+        <w:tc>
+          <w:tcPr>
+            <w:tcW w:type="dxa" w:w="2880"/>
+            <w:tcMar>
+              <w:top w:w="60" w:type="dxa"/>
+              <w:bottom w:w="60" w:type="dxa"/>
+              <w:left w:w="80" w:type="dxa"/>
+              <w:right w:w="80" w:type="dxa"/>
+            </w:tcMar>
+            <w:shd w:fill="FFFFFF"/>
+          </w:tcPr>
+          <w:p>
+            <w:r>
+              <w:rPr>
+                <w:sz w:val="19"/>
+              </w:rPr>
+              <w:t>backend/app/services/ai_service.py</w:t>
+              <w:br/>
+              <w:t>backend/app/models/aquashield_forensic_dualstream.pth</w:t>
+              <w:br/>
+              <w:t>POST /api/ai/verify-image</w:t>
+              <w:br/>
+              <w:t>POST /api/reports</w:t>
+            </w:r>
+          </w:p>
+        </w:tc>
+      </w:tr>
+    </w:tbl>
+    <w:p>
+      <w:pPr>
+        <w:spacing w:after="280"/>
+      </w:pPr>
+    </w:p>
     <w:sectPr>
       <w:pgSz w:w="12240" w:h="15840"/>
       <w:pgMar w:top="1440" w:right="1440" w:bottom="1440" w:left="1440" w:header="720" w:footer="720" w:gutter="0"/>

</xml_diff>